<commit_message>
Šablony smluv: oprava adresy v zápatí (Havířská 1021, 580 01 Havlíčkův Brod)
Co-Authored-By: Claude Sonnet 5.5 <noreply@anthropic.com>
</commit_message>
<xml_diff>
--- a/spfx/test-fixtures/contract/RES_OM_Priloha_lokality_SABLONA_v01.docx
+++ b/spfx/test-fixtures/contract/RES_OM_Priloha_lokality_SABLONA_v01.docx
@@ -3540,14 +3540,14 @@
                             <w:rPr>
                               <w:szCs w:val="20"/>
                             </w:rPr>
-                            <w:t>Havlířská</w:t>
+                            <w:t>Havířská</w:t>
                           </w:r>
                           <w:proofErr w:type="spellEnd"/>
                           <w:r>
                             <w:rPr>
                               <w:szCs w:val="20"/>
                             </w:rPr>
-                            <w:t xml:space="preserve"> 1021, 568 01 Havlíčkův Brod</w:t>
+                            <w:t xml:space="preserve"> 1021, 580 01 Havlíčkův Brod</w:t>
                           </w:r>
                           <w:r>
                             <w:rPr>
@@ -3729,14 +3729,14 @@
                       <w:rPr>
                         <w:szCs w:val="20"/>
                       </w:rPr>
-                      <w:t>Havlířská</w:t>
+                      <w:t>Havířská</w:t>
                     </w:r>
                     <w:proofErr w:type="spellEnd"/>
                     <w:r>
                       <w:rPr>
                         <w:szCs w:val="20"/>
                       </w:rPr>
-                      <w:t xml:space="preserve"> 1021, 568 01 Havlíčkův Brod</w:t>
+                      <w:t xml:space="preserve"> 1021, 580 01 Havlíčkův Brod</w:t>
                     </w:r>
                     <w:r>
                       <w:rPr>

</xml_diff>